<commit_message>
content: add Embrix'26 and Proj-Vega PR to resume achievements
</commit_message>
<xml_diff>
--- a/assets/Ponmudi_MR_Resume_2026.docx
+++ b/assets/Ponmudi_MR_Resume_2026.docx
@@ -715,7 +715,7 @@
           <w:sz w:val="20"/>
           <w:szCs w:val="20"/>
         </w:rPr>
-        <w:t>Placed 2nd at ChronoBIT'26 Hackathon by designing a 555-timer + CD4026 digital clock (HH:MM:SS) with rollover logic via segment decoding.</w:t>
+        <w:t>Placed 2nd at Embrix '26 Vegathon (₹10,000), BIT Sathy's national Embedded Systems &amp; Edge AI Hackathon with C-DAC; built the Vega-IoT Gateway on an ARIES v2.0 RISC-V board.</w:t>
       </w:r>
     </w:p>
     <w:p>
@@ -734,7 +734,7 @@
           <w:sz w:val="20"/>
           <w:szCs w:val="20"/>
         </w:rPr>
-        <w:t>Google Gemini Student Ambassador and IEEE Electron Devices Society member; active in BIT-IECC and AViNYA Club.</w:t>
+        <w:t>Placed 2nd at ChronoBIT'26 Hackathon by designing a 555-timer + CD4026 digital clock (HH:MM:SS) with rollover logic via segment decoding.</w:t>
       </w:r>
     </w:p>
     <w:p>
@@ -753,7 +753,26 @@
           <w:sz w:val="20"/>
           <w:szCs w:val="20"/>
         </w:rPr>
-        <w:t>[Add: any workshops/training you've conducted — e.g. 'Led a workshop on X for Y peers/juniors' — this is a strong leadership signal.]</w:t>
+        <w:t>Merged an upstream PR to idharshini/Proj-Vega removing hardcoded WiFi/MQTT credentials and fixing a WiFi-init boot hang.</w:t>
+      </w:r>
+    </w:p>
+    <w:p>
+      <w:pPr>
+        <w:pStyle w:val="ListParagraph"/>
+        <w:numPr>
+          <w:ilvl w:val="0"/>
+          <w:numId w:val="1"/>
+        </w:numPr>
+        <w:spacing w:before="0" w:after="40"/>
+        <w:rPr/>
+      </w:pPr>
+      <w:r>
+        <w:rPr>
+          <w:rFonts w:eastAsia="Calibri" w:cs="Calibri" w:ascii="Calibri" w:hAnsi="Calibri"/>
+          <w:sz w:val="20"/>
+          <w:szCs w:val="20"/>
+        </w:rPr>
+        <w:t>Google Gemini Student Ambassador and IEEE Electron Devices Society member; active in BIT-IECC and AViNYA Club.</w:t>
       </w:r>
     </w:p>
     <w:p>
@@ -848,7 +867,7 @@
     <w:sectPr>
       <w:type w:val="nextPage"/>
       <w:pgSz w:w="11906" w:h="16838"/>
-      <w:pgMar w:left="720" w:right="720" w:gutter="0" w:header="0" w:top="620" w:footer="0" w:bottom="620"/>
+      <w:pgMar w:left="720" w:right="720" w:gutter="0" w:header="0" w:top="430" w:footer="0" w:bottom="430"/>
       <w:pgNumType w:fmt="decimal"/>
       <w:formProt w:val="false"/>
       <w:textDirection w:val="lrTb"/>

</xml_diff>

<commit_message>
content: list NHIDE 2026 1st Prize as its own resume achievement
</commit_message>
<xml_diff>
--- a/assets/Ponmudi_MR_Resume_2026.docx
+++ b/assets/Ponmudi_MR_Resume_2026.docx
@@ -394,7 +394,7 @@
           <w:sz w:val="20"/>
           <w:szCs w:val="20"/>
         </w:rPr>
-        <w:t>Earned national recognition — 1st Prize (₹50,000) at NHIDE 2026 and National Finalist at IEEE YESIST12 2026 — for TribalNet's field-ready design.</w:t>
+        <w:t>Earned National Finalist recognition at IEEE YESIST12 2026 for TribalNet's field-ready design.</w:t>
       </w:r>
     </w:p>
     <w:p>
@@ -715,7 +715,7 @@
           <w:sz w:val="20"/>
           <w:szCs w:val="20"/>
         </w:rPr>
-        <w:t>Placed 2nd at Embrix '26 Vegathon (₹10,000), BIT Sathy's national Embedded Systems &amp; Edge AI Hackathon with C-DAC; built the Vega-IoT Gateway on an ARIES v2.0 RISC-V board.</w:t>
+        <w:t>Winner — 1st Prize (₹50,000) at NHIDE 2026, National Hackathon for Innovation, Design &amp; Entrepreneurship, for TribalNet's Solar-Powered RF Communication design.</w:t>
       </w:r>
     </w:p>
     <w:p>
@@ -734,7 +734,7 @@
           <w:sz w:val="20"/>
           <w:szCs w:val="20"/>
         </w:rPr>
-        <w:t>Placed 2nd at ChronoBIT'26 Hackathon by designing a 555-timer + CD4026 digital clock (HH:MM:SS) with rollover logic via segment decoding.</w:t>
+        <w:t>Placed 2nd at Embrix '26 Vegathon (₹10,000), BIT Sathy's national Embedded Systems &amp; Edge AI Hackathon with C-DAC; built the Vega-IoT Gateway on an ARIES v2.0 RISC-V board.</w:t>
       </w:r>
     </w:p>
     <w:p>
@@ -753,7 +753,7 @@
           <w:sz w:val="20"/>
           <w:szCs w:val="20"/>
         </w:rPr>
-        <w:t>Merged an upstream PR to idharshini/Proj-Vega removing hardcoded WiFi/MQTT credentials and fixing a WiFi-init boot hang.</w:t>
+        <w:t>Placed 2nd at ChronoBIT'26 Hackathon by designing a 555-timer + CD4026 digital clock (HH:MM:SS) with rollover logic via segment decoding.</w:t>
       </w:r>
     </w:p>
     <w:p>
@@ -772,6 +772,25 @@
           <w:sz w:val="20"/>
           <w:szCs w:val="20"/>
         </w:rPr>
+        <w:t>Merged an upstream PR to idharshini/Proj-Vega removing hardcoded WiFi/MQTT credentials and fixing a WiFi-init boot hang.</w:t>
+      </w:r>
+    </w:p>
+    <w:p>
+      <w:pPr>
+        <w:pStyle w:val="ListParagraph"/>
+        <w:numPr>
+          <w:ilvl w:val="0"/>
+          <w:numId w:val="1"/>
+        </w:numPr>
+        <w:spacing w:before="0" w:after="40"/>
+        <w:rPr/>
+      </w:pPr>
+      <w:r>
+        <w:rPr>
+          <w:rFonts w:eastAsia="Calibri" w:cs="Calibri" w:ascii="Calibri" w:hAnsi="Calibri"/>
+          <w:sz w:val="20"/>
+          <w:szCs w:val="20"/>
+        </w:rPr>
         <w:t>Google Gemini Student Ambassador and IEEE Electron Devices Society member; active in BIT-IECC and AViNYA Club.</w:t>
       </w:r>
     </w:p>
@@ -867,7 +886,7 @@
     <w:sectPr>
       <w:type w:val="nextPage"/>
       <w:pgSz w:w="11906" w:h="16838"/>
-      <w:pgMar w:left="720" w:right="720" w:gutter="0" w:header="0" w:top="430" w:footer="0" w:bottom="430"/>
+      <w:pgMar w:left="720" w:right="720" w:gutter="0" w:header="0" w:top="280" w:footer="0" w:bottom="280"/>
       <w:pgNumType w:fmt="decimal"/>
       <w:formProt w:val="false"/>
       <w:textDirection w:val="lrTb"/>

</xml_diff>